<commit_message>
Rework demo scenario to use ЭКО_2 directly instead of a new collection
Per direction: delete the three target documents from ЭКО_2 before
the meeting, demo the before/after live re-upload directly in ЭКО_2,
delete them again afterward to restore the reference corpus. Flags
that per-document deletion was unavailable earlier today for the eco
collection's для теста ИИ (1) folder -- that was someone else's
upload, so ЭКО_2 (our own upload) may behave differently, but this
needs to be verified with a trial deletion before the actual meeting,
not discovered live. Keeps demo-baza-bez-3-dokumentov.zip as a
fallback for a separate demo collection if deletion turns out to be
unavailable.

Co-Authored-By: Claude Sonnet 5 <noreply@anthropic.com>
Claude-Session: https://claude.ai/code/session_01DpSN8JwCJ3tg3JVUadr2zE
</commit_message>
<xml_diff>
--- a/docs/accounts/eco/scenarij-demonstracii-zhivoy-zagruzki.docx
+++ b/docs/accounts/eco/scenarij-demonstracii-zhivoy-zagruzki.docx
@@ -47,21 +47,7 @@
         <w:pStyle w:val="Heading2"/>
       </w:pPr>
       <w:r>
-        <w:t>Что подготовлено</w:t>
-      </w:r>
-    </w:p>
-    <w:p>
-      <w:r>
-        <w:t xml:space="preserve">- </w:t>
-      </w:r>
-      <w:r>
-        <w:rPr>
-          <w:b/>
-        </w:rPr>
-        <w:t>`demo-baza-bez-3-dokumentov.zip`</w:t>
-      </w:r>
-      <w:r>
-        <w:t xml:space="preserve"> — 24 из 27 документов корпуса </w:t>
+        <w:t xml:space="preserve">Подход: прямо в </w:t>
       </w:r>
       <w:r>
         <w:rPr>
@@ -71,7 +57,174 @@
         <w:t>ЭКО_2</w:t>
       </w:r>
       <w:r>
-        <w:t>, специально без трёх файлов ниже. Это стартовая загрузка для демо-коллекции.</w:t>
+        <w:t>, без отдельной демо-коллекции</w:t>
+      </w:r>
+    </w:p>
+    <w:p>
+      <w:r>
+        <w:rPr>
+          <w:b/>
+        </w:rPr>
+        <w:t>Решение (12.09.2026):</w:t>
+      </w:r>
+      <w:r>
+        <w:t xml:space="preserve"> не создавать отдельную демо-коллекцию — использовать </w:t>
+      </w:r>
+      <w:r>
+        <w:rPr>
+          <w:rFonts w:ascii="Consolas" w:hAnsi="Consolas"/>
+          <w:sz w:val="20"/>
+        </w:rPr>
+        <w:t>ЭКО_2</w:t>
+      </w:r>
+      <w:r>
+        <w:t xml:space="preserve"> напрямую. </w:t>
+      </w:r>
+      <w:r>
+        <w:rPr>
+          <w:rFonts w:ascii="Consolas" w:hAnsi="Consolas"/>
+          <w:sz w:val="20"/>
+        </w:rPr>
+        <w:t>ЭКО_2</w:t>
+      </w:r>
+      <w:r>
+        <w:t xml:space="preserve"> уже содержит все 27 документов, включая три ниже. Схема: </w:t>
+      </w:r>
+      <w:r>
+        <w:rPr>
+          <w:b/>
+        </w:rPr>
+        <w:t>удалить</w:t>
+      </w:r>
+      <w:r>
+        <w:t xml:space="preserve"> эти три файла из </w:t>
+      </w:r>
+      <w:r>
+        <w:rPr>
+          <w:rFonts w:ascii="Consolas" w:hAnsi="Consolas"/>
+          <w:sz w:val="20"/>
+        </w:rPr>
+        <w:t>ЭКО_2</w:t>
+      </w:r>
+      <w:r>
+        <w:t xml:space="preserve"> перед встречей → на демо показать «до» (документа нет) → загрузить его вживую → показать «после» → по завершении демо-цикла </w:t>
+      </w:r>
+      <w:r>
+        <w:rPr>
+          <w:b/>
+        </w:rPr>
+        <w:t>удалить обратно</w:t>
+      </w:r>
+      <w:r>
+        <w:t xml:space="preserve">, чтобы вернуть </w:t>
+      </w:r>
+      <w:r>
+        <w:rPr>
+          <w:rFonts w:ascii="Consolas" w:hAnsi="Consolas"/>
+          <w:sz w:val="20"/>
+        </w:rPr>
+        <w:t>ЭКО_2</w:t>
+      </w:r>
+      <w:r>
+        <w:t xml:space="preserve"> в чистое референсное состояние для дальнейших тестов.</w:t>
+      </w:r>
+    </w:p>
+    <w:p>
+      <w:r>
+        <w:rPr>
+          <w:b/>
+        </w:rPr>
+        <w:t>⚠️ Проверить заранее, до встречи с заказчиком: точечное удаление документа из `ЭКО_2` вообще доступно через UI.</w:t>
+      </w:r>
+      <w:r>
+        <w:t xml:space="preserve"> Сегодня при попытке удалить файл из коллекции </w:t>
+      </w:r>
+      <w:r>
+        <w:rPr>
+          <w:rFonts w:ascii="Consolas" w:hAnsi="Consolas"/>
+          <w:sz w:val="20"/>
+        </w:rPr>
+        <w:t>eco</w:t>
+      </w:r>
+      <w:r>
+        <w:t xml:space="preserve"> (папка </w:t>
+      </w:r>
+      <w:r>
+        <w:rPr>
+          <w:rFonts w:ascii="Consolas" w:hAnsi="Consolas"/>
+          <w:sz w:val="20"/>
+        </w:rPr>
+        <w:t>для теста ИИ (1)</w:t>
+      </w:r>
+      <w:r>
+        <w:t xml:space="preserve">) выяснилось, что точечного удаления там нет — ни в «Источники → Документы» (меню «...»: только Превью/Скачать оригинал/Разобранные данные), ни в администрировании коллекции (только настройки коллекции целиком, см. </w:t>
+      </w:r>
+      <w:r>
+        <w:rPr>
+          <w:rFonts w:ascii="Consolas" w:hAnsi="Consolas"/>
+          <w:sz w:val="20"/>
+        </w:rPr>
+        <w:t>pilot-test-03-eco2-protocol.md</w:t>
+      </w:r>
+      <w:r>
+        <w:t xml:space="preserve">, «Критическая находка»). Тот случай был про чужую загрузку (файлы </w:t>
+      </w:r>
+      <w:r>
+        <w:rPr>
+          <w:rFonts w:ascii="Consolas" w:hAnsi="Consolas"/>
+          <w:sz w:val="20"/>
+        </w:rPr>
+        <w:t>irina</w:t>
+      </w:r>
+      <w:r>
+        <w:t xml:space="preserve">) — для </w:t>
+      </w:r>
+      <w:r>
+        <w:rPr>
+          <w:rFonts w:ascii="Consolas" w:hAnsi="Consolas"/>
+          <w:sz w:val="20"/>
+        </w:rPr>
+        <w:t>ЭКО_2</w:t>
+      </w:r>
+      <w:r>
+        <w:t xml:space="preserve">, куда мы грузили сами, права могут быть другими, но это </w:t>
+      </w:r>
+      <w:r>
+        <w:rPr>
+          <w:b/>
+        </w:rPr>
+        <w:t>не проверено</w:t>
+      </w:r>
+      <w:r>
+        <w:t xml:space="preserve">. Сделать пробное удаление одного файла из </w:t>
+      </w:r>
+      <w:r>
+        <w:rPr>
+          <w:rFonts w:ascii="Consolas" w:hAnsi="Consolas"/>
+          <w:sz w:val="20"/>
+        </w:rPr>
+        <w:t>ЭКО_2</w:t>
+      </w:r>
+      <w:r>
+        <w:t xml:space="preserve"> заранее, не в день демо — если удаление действительно недоступно, вернуться к варианту с отдельной демо-коллекцией (материалы для него — </w:t>
+      </w:r>
+      <w:r>
+        <w:rPr>
+          <w:rFonts w:ascii="Consolas" w:hAnsi="Consolas"/>
+          <w:sz w:val="20"/>
+        </w:rPr>
+        <w:t>demo-baza-bez-3-dokumentov.zip</w:t>
+      </w:r>
+      <w:r>
+        <w:t>, всё ещё в репозитории на этот случай).</w:t>
+      </w:r>
+    </w:p>
+    <w:p>
+      <w:pPr>
+        <w:pStyle w:val="Heading2"/>
+      </w:pPr>
+      <w:r>
+        <w:t>Что подготовлено</w:t>
       </w:r>
     </w:p>
     <w:p>
@@ -85,7 +238,7 @@
         <w:t>`demo-live-upload/`</w:t>
       </w:r>
       <w:r>
-        <w:t xml:space="preserve"> — три документа, которые загружаются вживую по ходу демонстрации, каждый на своём кейсе:</w:t>
+        <w:t xml:space="preserve"> — три документа для живой загрузки, по одному на кейс:</w:t>
       </w:r>
     </w:p>
     <w:p>
@@ -134,6 +287,40 @@
       </w:r>
     </w:p>
     <w:p>
+      <w:r>
+        <w:t xml:space="preserve">- </w:t>
+      </w:r>
+      <w:r>
+        <w:rPr>
+          <w:b/>
+        </w:rPr>
+        <w:t>`demo-baza-bez-3-dokumentov.zip`</w:t>
+      </w:r>
+      <w:r>
+        <w:t xml:space="preserve"> — запасной вариант: 24 из 27 документов </w:t>
+      </w:r>
+      <w:r>
+        <w:rPr>
+          <w:rFonts w:ascii="Consolas" w:hAnsi="Consolas"/>
+          <w:sz w:val="20"/>
+        </w:rPr>
+        <w:t>ЭКО_2</w:t>
+      </w:r>
+      <w:r>
+        <w:t xml:space="preserve">, без этих трёх. Нужен только если удаление из </w:t>
+      </w:r>
+      <w:r>
+        <w:rPr>
+          <w:rFonts w:ascii="Consolas" w:hAnsi="Consolas"/>
+          <w:sz w:val="20"/>
+        </w:rPr>
+        <w:t>ЭКО_2</w:t>
+      </w:r>
+      <w:r>
+        <w:t xml:space="preserve"> окажется недоступно и придётся собирать отдельную демо-коллекцию с нуля.</w:t>
+      </w:r>
+    </w:p>
+    <w:p>
       <w:pPr>
         <w:pStyle w:val="Heading2"/>
       </w:pPr>
@@ -143,17 +330,16 @@
     </w:p>
     <w:p>
       <w:r>
-        <w:t xml:space="preserve">1. Создать отдельную демо-коллекцию (например, </w:t>
+        <w:t xml:space="preserve">1. </w:t>
       </w:r>
       <w:r>
         <w:rPr>
-          <w:rFonts w:ascii="Consolas" w:hAnsi="Consolas"/>
-          <w:sz w:val="20"/>
+          <w:b/>
         </w:rPr>
-        <w:t>ЭКО_Демо</w:t>
+        <w:t>Заранее (не в день демо)</w:t>
       </w:r>
       <w:r>
-        <w:t xml:space="preserve">), по аналогии с </w:t>
+        <w:t xml:space="preserve"> удалить из </w:t>
       </w:r>
       <w:r>
         <w:rPr>
@@ -163,56 +349,12 @@
         <w:t>ЭКО_2</w:t>
       </w:r>
       <w:r>
-        <w:t xml:space="preserve"> (см. </w:t>
-      </w:r>
-      <w:r>
-        <w:rPr>
-          <w:rFonts w:ascii="Consolas" w:hAnsi="Consolas"/>
-          <w:sz w:val="20"/>
-        </w:rPr>
-        <w:t>instrukciya-test-eko-2.md</w:t>
-      </w:r>
-      <w:r>
-        <w:t xml:space="preserve">, §3) — не переиспользовать </w:t>
-      </w:r>
-      <w:r>
-        <w:rPr>
-          <w:rFonts w:ascii="Consolas" w:hAnsi="Consolas"/>
-          <w:sz w:val="20"/>
-        </w:rPr>
-        <w:t>ЭКО_2</w:t>
-      </w:r>
-      <w:r>
-        <w:t>, чтобы не портить контрольную коллекцию для дальнейших тестов.</w:t>
+        <w:t xml:space="preserve"> три файла из списка выше — проверить, что удаление вообще работает, и дать время перепроверить, что коллекция снова показывает «Готово»/корректный статус после удаления (не «Ошибка»/«Обработка»).</w:t>
       </w:r>
     </w:p>
     <w:p>
       <w:r>
-        <w:t xml:space="preserve">2. Загрузить в неё </w:t>
-      </w:r>
-      <w:r>
-        <w:rPr>
-          <w:rFonts w:ascii="Consolas" w:hAnsi="Consolas"/>
-          <w:sz w:val="20"/>
-        </w:rPr>
-        <w:t>demo-baza-bez-3-dokumentov.zip</w:t>
-      </w:r>
-      <w:r>
-        <w:t xml:space="preserve"> (24 файла) заранее, до встречи с заказчиком. Дождаться статуса «Готово» у всех 24 — </w:t>
-      </w:r>
-      <w:r>
-        <w:rPr>
-          <w:b/>
-        </w:rPr>
-        <w:t>не начинать демо, пока индексация не завершена</w:t>
-      </w:r>
-      <w:r>
-        <w:t>.</w:t>
-      </w:r>
-    </w:p>
-    <w:p>
-      <w:r>
-        <w:t xml:space="preserve">3. Держать </w:t>
+        <w:t xml:space="preserve">2. Держать </w:t>
       </w:r>
       <w:r>
         <w:rPr>
@@ -227,7 +369,7 @@
     </w:p>
     <w:p>
       <w:r>
-        <w:t xml:space="preserve">4. Использовать агент </w:t>
+        <w:t xml:space="preserve">3. Использовать агент </w:t>
       </w:r>
       <w:r>
         <w:rPr>
@@ -251,7 +393,61 @@
     </w:p>
     <w:p>
       <w:r>
-        <w:t>5. Явно сузить область поиска (попап «Где искать») до демо-коллекции — проверить чекбокс перед первым вопросом, не полагаться на память интерфейса.</w:t>
+        <w:t xml:space="preserve">4. Явно сузить область поиска (попап «Где искать») до </w:t>
+      </w:r>
+      <w:r>
+        <w:rPr>
+          <w:rFonts w:ascii="Consolas" w:hAnsi="Consolas"/>
+          <w:sz w:val="20"/>
+        </w:rPr>
+        <w:t>ЭКО_2</w:t>
+      </w:r>
+      <w:r>
+        <w:t xml:space="preserve"> — проверить чекбокс перед первым вопросом, не полагаться на память интерфейса.</w:t>
+      </w:r>
+    </w:p>
+    <w:p>
+      <w:r>
+        <w:t xml:space="preserve">5. </w:t>
+      </w:r>
+      <w:r>
+        <w:rPr>
+          <w:b/>
+        </w:rPr>
+        <w:t>После демо</w:t>
+      </w:r>
+      <w:r>
+        <w:t xml:space="preserve"> (в тот же день или сразу после) — загрузить все три файла заново, если они ещё не все были загружены по ходу встречи (например, если демонстрировались не все 3 кейса), чтобы </w:t>
+      </w:r>
+      <w:r>
+        <w:rPr>
+          <w:rFonts w:ascii="Consolas" w:hAnsi="Consolas"/>
+          <w:sz w:val="20"/>
+        </w:rPr>
+        <w:t>ЭКО_2</w:t>
+      </w:r>
+      <w:r>
+        <w:t xml:space="preserve"> вернулась к полным 27/27 для дальнейших тестов. Если план — не восстанавливать, а действительно держать </w:t>
+      </w:r>
+      <w:r>
+        <w:rPr>
+          <w:rFonts w:ascii="Consolas" w:hAnsi="Consolas"/>
+          <w:sz w:val="20"/>
+        </w:rPr>
+        <w:t>ЭКО_2</w:t>
+      </w:r>
+      <w:r>
+        <w:t xml:space="preserve"> «пустой» на эти три файла до следующего демо, явно зафиксировать это решение в </w:t>
+      </w:r>
+      <w:r>
+        <w:rPr>
+          <w:rFonts w:ascii="Consolas" w:hAnsi="Consolas"/>
+          <w:sz w:val="20"/>
+        </w:rPr>
+        <w:t>README.md</w:t>
+      </w:r>
+      <w:r>
+        <w:t>, чтобы не запутаться при следующем тесте.</w:t>
       </w:r>
     </w:p>
     <w:p>

</xml_diff>